<commit_message>
research: revise G9 manuscript after literature-priority investigation
</commit_message>
<xml_diff>
--- a/research/v03/g9_paper/exports/manuscript.docx
+++ b/research/v03/g9_paper/exports/manuscript.docx
@@ -119,7 +119,7 @@
         <w:t xml:space="preserve"> </w:t>
       </w:r>
       <w:r>
-        <w:t xml:space="preserve">This technical note states a specialized upper bound for a corrected research implementation. Literature priority and suitability for a publication venue remain unresolved.</w:t>
+        <w:t xml:space="preserve">Revised after the source-specific priority investigation. The contribution is an incremental specialization of established methods; worldwide priority and suitability for a publication venue remain unresolved.</w:t>
       </w:r>
     </w:p>
     <w:bookmarkStart w:id="20" w:name="abstract"/>
@@ -364,18 +364,7 @@
         <w:t xml:space="preserve"> </w:t>
       </w:r>
       <w:r>
-        <w:t xml:space="preserve">auxiliary words, excluding the input and one returned output. The algorithm combines established sorted-difference dynamic programming and canonical self-reduction with a deficit-specific reduction. The omitted indices sum to</w:t>
-      </w:r>
-      <w:r>
-        <w:t xml:space="preserve"> </w:t>
-      </w:r>
-      <m:oMath>
-        <m:r>
-          <m:t>h</m:t>
-        </m:r>
-      </m:oMath>
-      <w:r>
-        <w:t xml:space="preserve">, giving a core of at most</w:t>
+        <w:t xml:space="preserve">auxiliary words, excluding the input and one returned output. The proof specializes established difference-sorted dynamic programming, exact-resource lifting, and sparse oracle reconstruction. An exact omission deficit yields a core of at most</w:t>
       </w:r>
       <w:r>
         <w:t xml:space="preserve"> </w:t>
@@ -453,7 +442,7 @@
         <w:t xml:space="preserve"> </w:t>
       </w:r>
       <w:r>
-        <w:t xml:space="preserve">eligible transitions, and at most</w:t>
+        <w:t xml:space="preserve">eligible transitions, and</w:t>
       </w:r>
       <w:r>
         <w:t xml:space="preserve"> </w:t>
@@ -488,7 +477,7 @@
         <w:t xml:space="preserve"> </w:t>
       </w:r>
       <w:r>
-        <w:t xml:space="preserve">omissions. A forced-prefix scalar oracle and monotone threshold queries reconstruct the complete canonical witness without storing witness histories. An accompanying computational audit checks 80,283 complete-witness instances and identifies a linear auxiliary allocation in the original implementation’s final validation; an indexed validation and deterministic output cursor repair it. The contribution is a specialized composition with explicit complexity accounting, without a claim of a new general dynamic-programming primitive or established literature priority.</w:t>
+        <w:t xml:space="preserve">omissions. We prove both the constrained scalar invariant and the complete lexicographic reconstruction guarantee, with every feasibility call charged. An inclusion-only formulation clarifies the relationship to earlier arbitrary-witness extraction. The preserved implementation audit contains 80,283 complete-witness comparisons and identifies an output-validation allocation repaired in a separate derivative. Additional reduction checks are reported separately. The contribution is an incremental specialized theorem and reproducible implementation analysis; it does not establish a new general extraction principle, worldwide priority, or asymptotic optimality.</w:t>
       </w:r>
     </w:p>
     <w:bookmarkEnd w:id="20"/>
@@ -631,7 +620,7 @@
         </m:r>
       </m:oMath>
       <w:r>
-        <w:t xml:space="preserve">. Its central reconstruction step selects omissions rather than testing every input position: an optimal omitted set has only</w:t>
+        <w:t xml:space="preserve">. Its reconstruction operates on omissions: an optimal omitted set has only</w:t>
       </w:r>
       <w:r>
         <w:t xml:space="preserve"> </w:t>
@@ -675,7 +664,52 @@
         <w:t xml:space="preserve"> </w:t>
       </w:r>
       <w:r>
-        <w:t xml:space="preserve">elements, and each next omission is found by binary search on a threshold feasibility predicate. The proof accounts for every repeated query, the compulsory suffix, event sorting, and output construction.</w:t>
+        <w:t xml:space="preserve">elements, and each next omission is found by binary search on a threshold feasibility predicate. Sparse extraction with</w:t>
+      </w:r>
+      <w:r>
+        <w:t xml:space="preserve"> </w:t>
+      </w:r>
+      <m:oMath>
+        <m:r>
+          <m:t>O</m:t>
+        </m:r>
+        <m:d>
+          <m:dPr>
+            <m:begChr m:val="("/>
+            <m:endChr m:val=")"/>
+            <m:sepChr m:val=""/>
+            <m:grow/>
+          </m:dPr>
+          <m:e>
+            <m:r>
+              <m:t>k</m:t>
+            </m:r>
+            <m:r>
+              <m:rPr>
+                <m:sty m:val="p"/>
+              </m:rPr>
+              <m:t>log</m:t>
+            </m:r>
+            <m:r>
+              <m:t>N</m:t>
+            </m:r>
+          </m:e>
+        </m:d>
+      </m:oMath>
+      <w:r>
+        <w:t xml:space="preserve"> </w:t>
+      </w:r>
+      <w:r>
+        <w:t xml:space="preserve">oracle queries was already established by Björklund, Kaski, and Kowalik</w:t>
+      </w:r>
+      <w:r>
+        <w:t xml:space="preserve"> </w:t>
+      </w:r>
+      <w:r>
+        <w:t xml:space="preserve">(Björklund, Kaski, and Kowalik 2014)</w:t>
+      </w:r>
+      <w:r>
+        <w:t xml:space="preserve">. Our analysis supplies the particular constrained oracle, preserves the entire original-index order, and accounts for the compulsory suffix, event sorting, repeated queries, and output construction.</w:t>
       </w:r>
     </w:p>
     <w:p>
@@ -683,13 +717,22 @@
         <w:pStyle w:val="BodyText"/>
       </w:pPr>
       <w:r>
-        <w:t xml:space="preserve">The mathematical mechanisms have clear antecedents. Accordingly, the intended contribution is a specialized bound and a reproducible audit of its implementation. The manuscript does not claim a general advance in canonical traceback, a lower-bound-optimal algorithm, or a demonstrated practical speedup. The corrected artifact and the original implementation are preserved separately in the MOCOSO research repository</w:t>
-      </w:r>
-      <w:r>
-        <w:t xml:space="preserve"> </w:t>
-      </w:r>
-      <w:r>
-        <w:t xml:space="preserve">(Saridakis 2026)</w:t>
+        <w:t xml:space="preserve">The mathematical mechanisms have clear antecedents. The full upper bound can be derived by combining them with elementary deficit structure, so its significance rests on the precise specialized guarantee and reproducible correction. The manuscript does not claim a general advance in canonical traceback, a lower-bound-optimal algorithm, or a demonstrated practical speedup. The corrected artifact and original implementation are preserved separately</w:t>
+      </w:r>
+      <w:r>
+        <w:t xml:space="preserve"> </w:t>
+      </w:r>
+      <w:r>
+        <w:t xml:space="preserve">(Saridakis 2026b)</w:t>
+      </w:r>
+      <w:r>
+        <w:t xml:space="preserve">. A subsequent source-specific investigation supplies the revised literature assessment and additional reduction checks</w:t>
+      </w:r>
+      <w:r>
+        <w:t xml:space="preserve"> </w:t>
+      </w:r>
+      <w:r>
+        <w:t xml:space="preserve">(Saridakis 2026a)</w:t>
       </w:r>
       <w:r>
         <w:t xml:space="preserve">.</w:t>
@@ -1973,7 +2016,7 @@
         <w:pStyle w:val="BodyText"/>
       </w:pPr>
       <w:r>
-        <w:t xml:space="preserve">Exact resource coordinates in dynamic programming are also standard. Turner describes equality-constrained resource shortest paths on acyclic digraphs and gives a pseudopolynomial algorithm</w:t>
+        <w:t xml:space="preserve">Exact resource coordinates in dynamic programming are also standard. Turner describes equality-constrained resource shortest paths on acyclic digraphs</w:t>
       </w:r>
       <w:r>
         <w:t xml:space="preserve"> </w:t>
@@ -1982,7 +2025,141 @@
         <w:t xml:space="preserve">(Turner 2011, equation (23), Theorem 2)</w:t>
       </w:r>
       <w:r>
-        <w:t xml:space="preserve">. Her result supplies an appropriate resource-DP template, but not the compressed event invariant or the deficit-dependent transition count needed here. Simply expanding a last-two-indices graph would not establish our stated bound.</w:t>
+        <w:t xml:space="preserve">. Wu et al. describe temporal-to-static path expansion</w:t>
+      </w:r>
+      <w:r>
+        <w:t xml:space="preserve"> </w:t>
+      </w:r>
+      <w:r>
+        <w:t xml:space="preserve">(Wu et al. 2014, sec. 5)</w:t>
+      </w:r>
+      <w:r>
+        <w:t xml:space="preserve">. For comparison, assign each eligible transition its difference rank as departure time and duration one. Temporal compatibility then enforces strictly increasing differences. Arrival/departure copies and waiting arcs give a graph with</w:t>
+      </w:r>
+      <w:r>
+        <w:t xml:space="preserve"> </w:t>
+      </w:r>
+      <m:oMath>
+        <m:r>
+          <m:t>O</m:t>
+        </m:r>
+        <m:d>
+          <m:dPr>
+            <m:begChr m:val="("/>
+            <m:endChr m:val=")"/>
+            <m:sepChr m:val=""/>
+            <m:grow/>
+          </m:dPr>
+          <m:e>
+            <m:r>
+              <m:t>M</m:t>
+            </m:r>
+            <m:r>
+              <m:rPr>
+                <m:sty m:val="p"/>
+              </m:rPr>
+              <m:t>+</m:t>
+            </m:r>
+            <m:r>
+              <m:t>p</m:t>
+            </m:r>
+          </m:e>
+        </m:d>
+      </m:oMath>
+      <w:r>
+        <w:t xml:space="preserve"> </w:t>
+      </w:r>
+      <w:r>
+        <w:t xml:space="preserve">vertices and arcs. Our adaptation assigns gap resource and cost minus one to travel arcs, zero to waiting arcs, and the appropriate initial resource and length to source arcs. Minimizing cost now maximizes selected length. An explicit exact-resource table on this graph uses</w:t>
+      </w:r>
+      <w:r>
+        <w:t xml:space="preserve"> </w:t>
+      </w:r>
+      <m:oMath>
+        <m:r>
+          <m:t>O</m:t>
+        </m:r>
+        <m:d>
+          <m:dPr>
+            <m:begChr m:val="("/>
+            <m:endChr m:val=")"/>
+            <m:sepChr m:val=""/>
+            <m:grow/>
+          </m:dPr>
+          <m:e>
+            <m:r>
+              <m:t>M</m:t>
+            </m:r>
+            <m:r>
+              <m:t>H</m:t>
+            </m:r>
+          </m:e>
+        </m:d>
+        <m:r>
+          <m:rPr>
+            <m:sty m:val="p"/>
+          </m:rPr>
+          <m:t>=</m:t>
+        </m:r>
+        <m:r>
+          <m:t>O</m:t>
+        </m:r>
+        <m:d>
+          <m:dPr>
+            <m:begChr m:val="("/>
+            <m:endChr m:val=")"/>
+            <m:sepChr m:val=""/>
+            <m:grow/>
+          </m:dPr>
+          <m:e>
+            <m:sSup>
+              <m:e>
+                <m:r>
+                  <m:t>H</m:t>
+                </m:r>
+              </m:e>
+              <m:sup>
+                <m:r>
+                  <m:t>2</m:t>
+                </m:r>
+              </m:sup>
+            </m:sSup>
+            <m:r>
+              <m:rPr>
+                <m:sty m:val="p"/>
+              </m:rPr>
+              <m:t>log</m:t>
+            </m:r>
+            <m:d>
+              <m:dPr>
+                <m:begChr m:val="("/>
+                <m:endChr m:val=")"/>
+                <m:sepChr m:val=""/>
+                <m:grow/>
+              </m:dPr>
+              <m:e>
+                <m:r>
+                  <m:t>h</m:t>
+                </m:r>
+                <m:r>
+                  <m:rPr>
+                    <m:sty m:val="p"/>
+                  </m:rPr>
+                  <m:t>+</m:t>
+                </m:r>
+                <m:r>
+                  <m:t>2</m:t>
+                </m:r>
+              </m:e>
+            </m:d>
+          </m:e>
+        </m:d>
+      </m:oMath>
+      <w:r>
+        <w:t xml:space="preserve"> </w:t>
+      </w:r>
+      <w:r>
+        <w:t xml:space="preserve">words. This reduction is our inference from the path representation, not a theorem stated by Wu et al.; the rolling endpoint compression proved below is still needed for quadratic space.</w:t>
       </w:r>
     </w:p>
     <w:p>
@@ -1990,7 +2167,7 @@
         <w:pStyle w:val="BodyText"/>
       </w:pPr>
       <w:r>
-        <w:t xml:space="preserve">Canonical witness search by constrained extension queries belongs to established self-reduction methods; Große, Rothe, and Wechsung explicitly discuss lexicographically first solutions in that setting</w:t>
+        <w:t xml:space="preserve">Canonical witness search by constrained extension queries belongs to established self-reduction methods</w:t>
       </w:r>
       <w:r>
         <w:t xml:space="preserve"> </w:t>
@@ -1999,16 +2176,16 @@
         <w:t xml:space="preserve">(Große, Rothe, and Wechsung 2006, sec. 3)</w:t>
       </w:r>
       <w:r>
-        <w:t xml:space="preserve">. Our use of threshold queries needs a proof that the particular constrained optimization oracle remains efficient. Unconstrained decision alone is insufficient for that conclusion. Low-space exact resource algorithms also occur in Subset Sum</w:t>
-      </w:r>
-      <w:r>
-        <w:t xml:space="preserve"> </w:t>
-      </w:r>
-      <w:r>
-        <w:t xml:space="preserve">(Jin, Vyas, and Williams 2020)</w:t>
-      </w:r>
-      <w:r>
-        <w:t xml:space="preserve">; their problem does not include selected-order convexity or this entire-index-tuple objective, so no black-box implication is asserted here.</w:t>
+        <w:t xml:space="preserve">. Creignou et al. describe lexicographic enumeration using extension queries; the directly inspected preprint locus is version 2, Section 3.2, Proposition 5</w:t>
+      </w:r>
+      <w:r>
+        <w:t xml:space="preserve"> </w:t>
+      </w:r>
+      <w:r>
+        <w:t xml:space="preserve">(Creignou et al. 2017)</w:t>
+      </w:r>
+      <w:r>
+        <w:t xml:space="preserve">. Our use of such queries requires proof that the particular constrained optimization oracle remains efficient.</w:t>
       </w:r>
     </w:p>
     <w:p>
@@ -2016,7 +2193,160 @@
         <w:pStyle w:val="BodyText"/>
       </w:pPr>
       <w:r>
-        <w:t xml:space="preserve">The surviving contribution is the joint specialized analysis: an exact omission deficit, a two-anchor core, a harmonic eligible-event bound, a constrained scalar sweep, and sparse omission reconstruction with all queries charged. These statements can be derived by combining familiar mechanisms with elementary problem structure. We did not identify the same complete theorem in the sources inspected on 24 October 2026. That bounded observation does not establish firstness, and an earlier equivalent result would substantially weaken the paper’s originality claim.</w:t>
+        <w:t xml:space="preserve">Björklund, Kaski, and Kowalik give deterministic extraction of a witness of size at most</w:t>
+      </w:r>
+      <w:r>
+        <w:t xml:space="preserve"> </w:t>
+      </w:r>
+      <m:oMath>
+        <m:r>
+          <m:t>k</m:t>
+        </m:r>
+      </m:oMath>
+      <w:r>
+        <w:t xml:space="preserve"> </w:t>
+      </w:r>
+      <w:r>
+        <w:t xml:space="preserve">from an</w:t>
+      </w:r>
+      <w:r>
+        <w:t xml:space="preserve"> </w:t>
+      </w:r>
+      <m:oMath>
+        <m:r>
+          <m:t>N</m:t>
+        </m:r>
+      </m:oMath>
+      <w:r>
+        <w:t xml:space="preserve">-element universe using at most</w:t>
+      </w:r>
+      <w:r>
+        <w:t xml:space="preserve"> </w:t>
+      </w:r>
+      <m:oMath>
+        <m:r>
+          <m:t>2</m:t>
+        </m:r>
+        <m:r>
+          <m:t>k</m:t>
+        </m:r>
+        <m:d>
+          <m:dPr>
+            <m:begChr m:val="("/>
+            <m:endChr m:val=")"/>
+            <m:sepChr m:val=""/>
+            <m:grow/>
+          </m:dPr>
+          <m:e>
+            <m:sSub>
+              <m:e>
+                <m:r>
+                  <m:rPr>
+                    <m:sty m:val="p"/>
+                  </m:rPr>
+                  <m:t>log</m:t>
+                </m:r>
+              </m:e>
+              <m:sub>
+                <m:r>
+                  <m:t>2</m:t>
+                </m:r>
+              </m:sub>
+            </m:sSub>
+            <m:d>
+              <m:dPr>
+                <m:begChr m:val="("/>
+                <m:endChr m:val=")"/>
+                <m:sepChr m:val=""/>
+                <m:grow/>
+              </m:dPr>
+              <m:e>
+                <m:r>
+                  <m:t>N</m:t>
+                </m:r>
+                <m:r>
+                  <m:rPr>
+                    <m:sty m:val="p"/>
+                  </m:rPr>
+                  <m:t>/</m:t>
+                </m:r>
+                <m:r>
+                  <m:t>k</m:t>
+                </m:r>
+              </m:e>
+            </m:d>
+            <m:r>
+              <m:rPr>
+                <m:sty m:val="p"/>
+              </m:rPr>
+              <m:t>+</m:t>
+            </m:r>
+            <m:r>
+              <m:t>2</m:t>
+            </m:r>
+          </m:e>
+        </m:d>
+      </m:oMath>
+      <w:r>
+        <w:t xml:space="preserve"> </w:t>
+      </w:r>
+      <w:r>
+        <w:t xml:space="preserve">inclusion-oracle queries</w:t>
+      </w:r>
+      <w:r>
+        <w:t xml:space="preserve"> </w:t>
+      </w:r>
+      <w:r>
+        <w:t xml:space="preserve">(Björklund, Kaski, and Kowalik 2014, full version, Theorem 1)</w:t>
+      </w:r>
+      <w:r>
+        <w:t xml:space="preserve">. The conference publication is from 2014; the numbered theorem and algorithm inspected here are in the 2015 full version. An inclusion query asks whether some witness is contained in a permitted set. Their Algorithm 1 permits arbitrary balanced partitions and does not prescribe our lexicographic optimum. Section 6 gives a counterexample to that automatic transfer and an elementary ordered adaptation. We do not claim novelty for sparse extraction or that adaptation. The paper’s stronger total-runtime transfer also assumes that oracle cost scales appropriately with the shrinking universe. Our original index weights and resource limit remain fixed after restrictions, so we charge each query at its full proved cost.</w:t>
+      </w:r>
+    </w:p>
+    <w:p>
+      <w:pPr>
+        <w:pStyle w:val="BodyText"/>
+      </w:pPr>
+      <w:r>
+        <w:t xml:space="preserve">Meeks distinguishes inclusion queries from extension queries that additionally require specified elements</w:t>
+      </w:r>
+      <w:r>
+        <w:t xml:space="preserve"> </w:t>
+      </w:r>
+      <w:r>
+        <w:t xml:space="preserve">(Meeks 2018, sec. 1 and 3)</w:t>
+      </w:r>
+      <w:r>
+        <w:t xml:space="preserve">. This distinction matters: an efficient existence procedure does not generally answer arbitrary forced-prefix questions. We prove the constrained sweep directly. An alternative inclusion-only reconstruction maintains that its previously chosen elements are essential to every remaining optimum; it does not solve the arbitrary extension problem. Low-space Subset Sum algorithms</w:t>
+      </w:r>
+      <w:r>
+        <w:t xml:space="preserve"> </w:t>
+      </w:r>
+      <w:r>
+        <w:t xml:space="preserve">(Jin, Vyas, and Williams 2020)</w:t>
+      </w:r>
+      <w:r>
+        <w:t xml:space="preserve"> </w:t>
+      </w:r>
+      <w:r>
+        <w:t xml:space="preserve">likewise cannot be transferred without retaining the selected complement’s convexity constraint.</w:t>
+      </w:r>
+    </w:p>
+    <w:p>
+      <w:pPr>
+        <w:pStyle w:val="BodyText"/>
+      </w:pPr>
+      <w:r>
+        <w:t xml:space="preserve">The surviving contribution is the joint specialized analysis: an exact omission deficit, a two-anchor core, a harmonic eligible-event bound, a constrained scalar sweep, and complete lexicographic reconstruction with all queries charged. This is an incremental composition of established mechanisms and elementary problem structure. The documented investigation used thirty queries across two search engines, primary-source follow-up, and limited citation chaining</w:t>
+      </w:r>
+      <w:r>
+        <w:t xml:space="preserve"> </w:t>
+      </w:r>
+      <w:r>
+        <w:t xml:space="preserve">(Saridakis 2026a)</w:t>
+      </w:r>
+      <w:r>
+        <w:t xml:space="preserve">. It found no source stating the same complete theorem, but did not exhaust the literature. Earlier explicit statement, present-day derivability from known methods, and scientific significance are separate questions; only the second is established by the derivation here.</w:t>
       </w:r>
     </w:p>
     <w:bookmarkEnd w:id="23"/>
@@ -5833,7 +6163,7 @@
       </m:oMath>
     </w:p>
     <w:bookmarkEnd w:id="25"/>
-    <w:bookmarkStart w:id="26" w:name="Xcd2a2e99df27a7c49629b537d3c4a9985e640eb"/>
+    <w:bookmarkStart w:id="27" w:name="Xcd2a2e99df27a7c49629b537d3c4a9985e640eb"/>
     <w:p>
       <w:pPr>
         <w:pStyle w:val="Heading1"/>
@@ -7551,8 +7881,1230 @@
         </m:r>
       </m:oMath>
     </w:p>
+    <w:bookmarkStart w:id="26" w:name="X88256151bc49a8a2e8973e67aa6a2fe6ea2478b"/>
+    <w:p>
+      <w:pPr>
+        <w:pStyle w:val="Heading2"/>
+      </w:pPr>
+      <w:r>
+        <w:t xml:space="preserve">Inclusion only reconstruction and its relationship to prior extraction</w:t>
+      </w:r>
+    </w:p>
+    <w:p>
+      <w:pPr>
+        <w:pStyle w:val="FirstParagraph"/>
+      </w:pPr>
+      <w:r>
+        <w:t xml:space="preserve">The forced-prefix formulation above matches the corrected G9 implementation. A second formulation makes the connection to inclusion-oracle extraction explicit.</w:t>
+      </w:r>
+    </w:p>
+    <w:p>
+      <w:pPr>
+        <w:pStyle w:val="BodyText"/>
+      </w:pPr>
+      <w:r>
+        <w:rPr>
+          <w:bCs/>
+          <w:b/>
+        </w:rPr>
+        <w:t xml:space="preserve">Proposition 9.</w:t>
+      </w:r>
+      <w:r>
+        <w:t xml:space="preserve"> </w:t>
+      </w:r>
+      <w:r>
+        <w:t xml:space="preserve">Let</w:t>
+      </w:r>
+      <w:r>
+        <w:t xml:space="preserve"> </w:t>
+      </w:r>
+      <m:oMath>
+        <m:r>
+          <m:rPr>
+            <m:sty m:val="p"/>
+            <m:scr m:val="script"/>
+          </m:rPr>
+          <m:t>F</m:t>
+        </m:r>
+      </m:oMath>
+      <w:r>
+        <w:t xml:space="preserve"> </w:t>
+      </w:r>
+      <w:r>
+        <w:t xml:space="preserve">be a nonempty family of</w:t>
+      </w:r>
+      <w:r>
+        <w:t xml:space="preserve"> </w:t>
+      </w:r>
+      <m:oMath>
+        <m:r>
+          <m:t>k</m:t>
+        </m:r>
+      </m:oMath>
+      <w:r>
+        <w:t xml:space="preserve">-element subsets of</w:t>
+      </w:r>
+      <w:r>
+        <w:t xml:space="preserve"> </w:t>
+      </w:r>
+      <m:oMath>
+        <m:d>
+          <m:dPr>
+            <m:begChr m:val="["/>
+            <m:endChr m:val="]"/>
+            <m:sepChr m:val=""/>
+            <m:grow/>
+          </m:dPr>
+          <m:e>
+            <m:r>
+              <m:t>N</m:t>
+            </m:r>
+          </m:e>
+        </m:d>
+      </m:oMath>
+      <w:r>
+        <w:t xml:space="preserve">. Given an oracle</w:t>
+      </w:r>
+      <w:r>
+        <w:t xml:space="preserve"> </w:t>
+      </w:r>
+      <m:oMath>
+        <m:r>
+          <m:t>I</m:t>
+        </m:r>
+        <m:d>
+          <m:dPr>
+            <m:begChr m:val="("/>
+            <m:endChr m:val=")"/>
+            <m:sepChr m:val=""/>
+            <m:grow/>
+          </m:dPr>
+          <m:e>
+            <m:r>
+              <m:t>Y</m:t>
+            </m:r>
+          </m:e>
+        </m:d>
+      </m:oMath>
+      <w:r>
+        <w:t xml:space="preserve"> </w:t>
+      </w:r>
+      <w:r>
+        <w:t xml:space="preserve">deciding whether some</w:t>
+      </w:r>
+      <w:r>
+        <w:t xml:space="preserve"> </w:t>
+      </w:r>
+      <m:oMath>
+        <m:r>
+          <m:t>D</m:t>
+        </m:r>
+        <m:r>
+          <m:rPr>
+            <m:sty m:val="p"/>
+          </m:rPr>
+          <m:t>∈</m:t>
+        </m:r>
+        <m:r>
+          <m:rPr>
+            <m:sty m:val="p"/>
+            <m:scr m:val="script"/>
+          </m:rPr>
+          <m:t>F</m:t>
+        </m:r>
+      </m:oMath>
+      <w:r>
+        <w:t xml:space="preserve"> </w:t>
+      </w:r>
+      <w:r>
+        <w:t xml:space="preserve">is contained in</w:t>
+      </w:r>
+      <w:r>
+        <w:t xml:space="preserve"> </w:t>
+      </w:r>
+      <m:oMath>
+        <m:r>
+          <m:t>Y</m:t>
+        </m:r>
+      </m:oMath>
+      <w:r>
+        <w:t xml:space="preserve">, the lexicographically greatest increasing witness tuple can be extracted with at most</w:t>
+      </w:r>
+      <w:r>
+        <w:t xml:space="preserve"> </w:t>
+      </w:r>
+      <m:oMath>
+        <m:r>
+          <m:t>k</m:t>
+        </m:r>
+        <m:r>
+          <m:rPr>
+            <m:sty m:val="p"/>
+          </m:rPr>
+          <m:t>ceil</m:t>
+        </m:r>
+        <m:d>
+          <m:dPr>
+            <m:begChr m:val="("/>
+            <m:endChr m:val=")"/>
+            <m:sepChr m:val=""/>
+            <m:grow/>
+          </m:dPr>
+          <m:e>
+            <m:sSub>
+              <m:e>
+                <m:r>
+                  <m:rPr>
+                    <m:sty m:val="p"/>
+                  </m:rPr>
+                  <m:t>log</m:t>
+                </m:r>
+              </m:e>
+              <m:sub>
+                <m:r>
+                  <m:t>2</m:t>
+                </m:r>
+              </m:sub>
+            </m:sSub>
+            <m:d>
+              <m:dPr>
+                <m:begChr m:val="("/>
+                <m:endChr m:val=")"/>
+                <m:sepChr m:val=""/>
+                <m:grow/>
+              </m:dPr>
+              <m:e>
+                <m:r>
+                  <m:t>N</m:t>
+                </m:r>
+                <m:r>
+                  <m:rPr>
+                    <m:sty m:val="p"/>
+                  </m:rPr>
+                  <m:t>+</m:t>
+                </m:r>
+                <m:r>
+                  <m:t>1</m:t>
+                </m:r>
+              </m:e>
+            </m:d>
+          </m:e>
+        </m:d>
+      </m:oMath>
+      <w:r>
+        <w:t xml:space="preserve"> </w:t>
+      </w:r>
+      <w:r>
+        <w:t xml:space="preserve">threshold queries, assuming existence and</w:t>
+      </w:r>
+      <w:r>
+        <w:t xml:space="preserve"> </w:t>
+      </w:r>
+      <m:oMath>
+        <m:r>
+          <m:t>k</m:t>
+        </m:r>
+      </m:oMath>
+      <w:r>
+        <w:t xml:space="preserve"> </w:t>
+      </w:r>
+      <w:r>
+        <w:t xml:space="preserve">are known. For</w:t>
+      </w:r>
+      <w:r>
+        <w:t xml:space="preserve"> </w:t>
+      </w:r>
+      <m:oMath>
+        <m:r>
+          <m:t>k</m:t>
+        </m:r>
+        <m:r>
+          <m:rPr>
+            <m:sty m:val="p"/>
+          </m:rPr>
+          <m:t>=</m:t>
+        </m:r>
+        <m:r>
+          <m:t>0</m:t>
+        </m:r>
+      </m:oMath>
+      <w:r>
+        <w:t xml:space="preserve">, return the empty tuple without queries.</w:t>
+      </w:r>
+    </w:p>
+    <w:p>
+      <w:pPr>
+        <w:pStyle w:val="BodyText"/>
+      </w:pPr>
+      <w:r>
+        <w:rPr>
+          <w:iCs/>
+          <w:i/>
+        </w:rPr>
+        <w:t xml:space="preserve">Proof.</w:t>
+      </w:r>
+      <w:r>
+        <w:t xml:space="preserve"> </w:t>
+      </w:r>
+      <w:r>
+        <w:t xml:space="preserve">Maintain a chosen tuple</w:t>
+      </w:r>
+      <w:r>
+        <w:t xml:space="preserve"> </w:t>
+      </w:r>
+      <m:oMath>
+        <m:r>
+          <m:t>Q</m:t>
+        </m:r>
+      </m:oMath>
+      <w:r>
+        <w:t xml:space="preserve"> </w:t>
+      </w:r>
+      <w:r>
+        <w:t xml:space="preserve">with last element</w:t>
+      </w:r>
+      <w:r>
+        <w:t xml:space="preserve"> </w:t>
+      </w:r>
+      <m:oMath>
+        <m:r>
+          <m:t>b</m:t>
+        </m:r>
+      </m:oMath>
+      <w:r>
+        <w:t xml:space="preserve">, initially empty with</w:t>
+      </w:r>
+      <w:r>
+        <w:t xml:space="preserve"> </w:t>
+      </w:r>
+      <m:oMath>
+        <m:r>
+          <m:t>b</m:t>
+        </m:r>
+        <m:r>
+          <m:rPr>
+            <m:sty m:val="p"/>
+          </m:rPr>
+          <m:t>=</m:t>
+        </m:r>
+        <m:r>
+          <m:t>0</m:t>
+        </m:r>
+      </m:oMath>
+      <w:r>
+        <w:t xml:space="preserve">. The invariant is that at least one witness is contained in</w:t>
+      </w:r>
+      <w:r>
+        <w:t xml:space="preserve"> </w:t>
+      </w:r>
+      <m:oMath>
+        <m:r>
+          <m:t>Q</m:t>
+        </m:r>
+        <m:r>
+          <m:rPr>
+            <m:sty m:val="p"/>
+          </m:rPr>
+          <m:t>∪</m:t>
+        </m:r>
+        <m:r>
+          <m:rPr>
+            <m:sty m:val="p"/>
+          </m:rPr>
+          <m:t>{</m:t>
+        </m:r>
+        <m:r>
+          <m:t>b</m:t>
+        </m:r>
+        <m:r>
+          <m:rPr>
+            <m:sty m:val="p"/>
+          </m:rPr>
+          <m:t>+</m:t>
+        </m:r>
+        <m:r>
+          <m:t>1</m:t>
+        </m:r>
+        <m:r>
+          <m:rPr>
+            <m:sty m:val="p"/>
+          </m:rPr>
+          <m:t>,</m:t>
+        </m:r>
+        <m:r>
+          <m:rPr>
+            <m:sty m:val="p"/>
+          </m:rPr>
+          <m:t>…</m:t>
+        </m:r>
+        <m:r>
+          <m:rPr>
+            <m:sty m:val="p"/>
+          </m:rPr>
+          <m:t>,</m:t>
+        </m:r>
+        <m:r>
+          <m:t>N</m:t>
+        </m:r>
+        <m:r>
+          <m:rPr>
+            <m:sty m:val="p"/>
+          </m:rPr>
+          <m:t>}</m:t>
+        </m:r>
+      </m:oMath>
+      <w:r>
+        <w:t xml:space="preserve"> </w:t>
+      </w:r>
+      <w:r>
+        <w:t xml:space="preserve">and every such witness contains</w:t>
+      </w:r>
+      <w:r>
+        <w:t xml:space="preserve"> </w:t>
+      </w:r>
+      <m:oMath>
+        <m:r>
+          <m:t>Q</m:t>
+        </m:r>
+      </m:oMath>
+      <w:r>
+        <w:t xml:space="preserve">. While</w:t>
+      </w:r>
+      <w:r>
+        <w:t xml:space="preserve"> </w:t>
+      </w:r>
+      <m:oMath>
+        <m:d>
+          <m:dPr>
+            <m:begChr m:val="|"/>
+            <m:endChr m:val="|"/>
+            <m:sepChr m:val=""/>
+            <m:grow/>
+          </m:dPr>
+          <m:e>
+            <m:r>
+              <m:t>Q</m:t>
+            </m:r>
+          </m:e>
+        </m:d>
+        <m:r>
+          <m:rPr>
+            <m:sty m:val="p"/>
+          </m:rPr>
+          <m:t>&lt;</m:t>
+        </m:r>
+        <m:r>
+          <m:t>k</m:t>
+        </m:r>
+      </m:oMath>
+      <w:r>
+        <w:t xml:space="preserve">, binary-search the greatest</w:t>
+      </w:r>
+      <w:r>
+        <w:t xml:space="preserve"> </w:t>
+      </w:r>
+      <m:oMath>
+        <m:r>
+          <m:t>x</m:t>
+        </m:r>
+        <m:r>
+          <m:rPr>
+            <m:sty m:val="p"/>
+          </m:rPr>
+          <m:t>∈</m:t>
+        </m:r>
+        <m:d>
+          <m:dPr>
+            <m:begChr m:val="["/>
+            <m:endChr m:val="]"/>
+            <m:sepChr m:val=""/>
+            <m:grow/>
+          </m:dPr>
+          <m:e>
+            <m:r>
+              <m:t>b</m:t>
+            </m:r>
+            <m:r>
+              <m:rPr>
+                <m:sty m:val="p"/>
+              </m:rPr>
+              <m:t>+</m:t>
+            </m:r>
+            <m:r>
+              <m:t>1</m:t>
+            </m:r>
+            <m:r>
+              <m:rPr>
+                <m:sty m:val="p"/>
+              </m:rPr>
+              <m:t>,</m:t>
+            </m:r>
+            <m:r>
+              <m:t>N</m:t>
+            </m:r>
+          </m:e>
+        </m:d>
+      </m:oMath>
+      <w:r>
+        <w:t xml:space="preserve"> </w:t>
+      </w:r>
+      <w:r>
+        <w:t xml:space="preserve">such that</w:t>
+      </w:r>
+    </w:p>
+    <w:p>
+      <w:pPr>
+        <w:pStyle w:val="BodyText"/>
+      </w:pPr>
+      <m:oMathPara>
+        <m:oMathParaPr>
+          <m:jc m:val="center"/>
+        </m:oMathParaPr>
+        <m:oMath>
+          <m:r>
+            <m:t>I</m:t>
+          </m:r>
+          <m:d>
+            <m:dPr>
+              <m:begChr m:val="("/>
+              <m:endChr m:val=")"/>
+              <m:sepChr m:val=""/>
+              <m:grow/>
+            </m:dPr>
+            <m:e>
+              <m:r>
+                <m:t>Q</m:t>
+              </m:r>
+              <m:r>
+                <m:rPr>
+                  <m:sty m:val="p"/>
+                </m:rPr>
+                <m:t>∪</m:t>
+              </m:r>
+              <m:r>
+                <m:rPr>
+                  <m:sty m:val="p"/>
+                </m:rPr>
+                <m:t>{</m:t>
+              </m:r>
+              <m:r>
+                <m:t>x</m:t>
+              </m:r>
+              <m:r>
+                <m:rPr>
+                  <m:sty m:val="p"/>
+                </m:rPr>
+                <m:t>,</m:t>
+              </m:r>
+              <m:r>
+                <m:rPr>
+                  <m:sty m:val="p"/>
+                </m:rPr>
+                <m:t>…</m:t>
+              </m:r>
+              <m:r>
+                <m:rPr>
+                  <m:sty m:val="p"/>
+                </m:rPr>
+                <m:t>,</m:t>
+              </m:r>
+              <m:r>
+                <m:t>N</m:t>
+              </m:r>
+              <m:r>
+                <m:rPr>
+                  <m:sty m:val="p"/>
+                </m:rPr>
+                <m:t>}</m:t>
+              </m:r>
+            </m:e>
+          </m:d>
+          <m:r>
+            <m:rPr>
+              <m:sty m:val="p"/>
+            </m:rPr>
+            <m:t>=</m:t>
+          </m:r>
+          <m:r>
+            <m:rPr>
+              <m:sty m:val="p"/>
+            </m:rPr>
+            <m:t>t</m:t>
+          </m:r>
+          <m:r>
+            <m:rPr>
+              <m:sty m:val="p"/>
+            </m:rPr>
+            <m:t>r</m:t>
+          </m:r>
+          <m:r>
+            <m:rPr>
+              <m:sty m:val="p"/>
+            </m:rPr>
+            <m:t>u</m:t>
+          </m:r>
+          <m:r>
+            <m:rPr>
+              <m:sty m:val="p"/>
+            </m:rPr>
+            <m:t>e</m:t>
+          </m:r>
+          <m:r>
+            <m:rPr>
+              <m:sty m:val="p"/>
+            </m:rPr>
+            <m:t>.</m:t>
+          </m:r>
+        </m:oMath>
+      </m:oMathPara>
+    </w:p>
+    <w:p>
+      <w:pPr>
+        <w:pStyle w:val="FirstParagraph"/>
+      </w:pPr>
+      <w:r>
+        <w:t xml:space="preserve">The predicate is monotone because the permitted sets shrink. The lower endpoint is true by the invariant, and the sentinel</w:t>
+      </w:r>
+      <w:r>
+        <w:t xml:space="preserve"> </w:t>
+      </w:r>
+      <m:oMath>
+        <m:r>
+          <m:t>x</m:t>
+        </m:r>
+        <m:r>
+          <m:rPr>
+            <m:sty m:val="p"/>
+          </m:rPr>
+          <m:t>=</m:t>
+        </m:r>
+        <m:r>
+          <m:t>N</m:t>
+        </m:r>
+        <m:r>
+          <m:rPr>
+            <m:sty m:val="p"/>
+          </m:rPr>
+          <m:t>+</m:t>
+        </m:r>
+        <m:r>
+          <m:t>1</m:t>
+        </m:r>
+      </m:oMath>
+      <w:r>
+        <w:t xml:space="preserve"> </w:t>
+      </w:r>
+      <w:r>
+        <w:t xml:space="preserve">is false because</w:t>
+      </w:r>
+      <w:r>
+        <w:t xml:space="preserve"> </w:t>
+      </w:r>
+      <m:oMath>
+        <m:r>
+          <m:t>Q</m:t>
+        </m:r>
+      </m:oMath>
+      <w:r>
+        <w:t xml:space="preserve"> </w:t>
+      </w:r>
+      <w:r>
+        <w:t xml:space="preserve">alone has fewer than</w:t>
+      </w:r>
+      <w:r>
+        <w:t xml:space="preserve"> </w:t>
+      </w:r>
+      <m:oMath>
+        <m:r>
+          <m:t>k</m:t>
+        </m:r>
+      </m:oMath>
+      <w:r>
+        <w:t xml:space="preserve"> </w:t>
+      </w:r>
+      <w:r>
+        <w:t xml:space="preserve">elements. At the greatest true threshold</w:t>
+      </w:r>
+      <w:r>
+        <w:t xml:space="preserve"> </w:t>
+      </w:r>
+      <m:oMath>
+        <m:r>
+          <m:t>q</m:t>
+        </m:r>
+      </m:oMath>
+      <w:r>
+        <w:t xml:space="preserve">, every remaining witness contains</w:t>
+      </w:r>
+      <w:r>
+        <w:t xml:space="preserve"> </w:t>
+      </w:r>
+      <m:oMath>
+        <m:r>
+          <m:t>q</m:t>
+        </m:r>
+      </m:oMath>
+      <w:r>
+        <w:t xml:space="preserve">: otherwise it would also fit in</w:t>
+      </w:r>
+      <w:r>
+        <w:t xml:space="preserve"> </w:t>
+      </w:r>
+      <m:oMath>
+        <m:r>
+          <m:t>Q</m:t>
+        </m:r>
+        <m:r>
+          <m:rPr>
+            <m:sty m:val="p"/>
+          </m:rPr>
+          <m:t>∪</m:t>
+        </m:r>
+        <m:r>
+          <m:rPr>
+            <m:sty m:val="p"/>
+          </m:rPr>
+          <m:t>{</m:t>
+        </m:r>
+        <m:r>
+          <m:t>q</m:t>
+        </m:r>
+        <m:r>
+          <m:rPr>
+            <m:sty m:val="p"/>
+          </m:rPr>
+          <m:t>+</m:t>
+        </m:r>
+        <m:r>
+          <m:t>1</m:t>
+        </m:r>
+        <m:r>
+          <m:rPr>
+            <m:sty m:val="p"/>
+          </m:rPr>
+          <m:t>,</m:t>
+        </m:r>
+        <m:r>
+          <m:rPr>
+            <m:sty m:val="p"/>
+          </m:rPr>
+          <m:t>…</m:t>
+        </m:r>
+        <m:r>
+          <m:rPr>
+            <m:sty m:val="p"/>
+          </m:rPr>
+          <m:t>,</m:t>
+        </m:r>
+        <m:r>
+          <m:t>N</m:t>
+        </m:r>
+        <m:r>
+          <m:rPr>
+            <m:sty m:val="p"/>
+          </m:rPr>
+          <m:t>}</m:t>
+        </m:r>
+      </m:oMath>
+      <w:r>
+        <w:t xml:space="preserve">. Earlier chosen elements remain essential under restriction. Appending</w:t>
+      </w:r>
+      <w:r>
+        <w:t xml:space="preserve"> </w:t>
+      </w:r>
+      <m:oMath>
+        <m:r>
+          <m:t>q</m:t>
+        </m:r>
+      </m:oMath>
+      <w:r>
+        <w:t xml:space="preserve"> </w:t>
+      </w:r>
+      <w:r>
+        <w:t xml:space="preserve">therefore preserves the invariant and maximizes the next coordinate. After</w:t>
+      </w:r>
+      <w:r>
+        <w:t xml:space="preserve"> </w:t>
+      </w:r>
+      <m:oMath>
+        <m:r>
+          <m:t>k</m:t>
+        </m:r>
+      </m:oMath>
+      <w:r>
+        <w:t xml:space="preserve"> </w:t>
+      </w:r>
+      <w:r>
+        <w:t xml:space="preserve">stages the chosen tuple is the lexicographic maximum. Binary search gives the query bound. Explicit query-set construction costs</w:t>
+      </w:r>
+      <w:r>
+        <w:t xml:space="preserve"> </w:t>
+      </w:r>
+      <m:oMath>
+        <m:r>
+          <m:t>O</m:t>
+        </m:r>
+        <m:d>
+          <m:dPr>
+            <m:begChr m:val="("/>
+            <m:endChr m:val=")"/>
+            <m:sepChr m:val=""/>
+            <m:grow/>
+          </m:dPr>
+          <m:e>
+            <m:r>
+              <m:t>N</m:t>
+            </m:r>
+          </m:e>
+        </m:d>
+      </m:oMath>
+      <w:r>
+        <w:t xml:space="preserve"> </w:t>
+      </w:r>
+      <w:r>
+        <w:t xml:space="preserve">per call and</w:t>
+      </w:r>
+      <w:r>
+        <w:t xml:space="preserve"> </w:t>
+      </w:r>
+      <m:oMath>
+        <m:r>
+          <m:t>O</m:t>
+        </m:r>
+        <m:d>
+          <m:dPr>
+            <m:begChr m:val="("/>
+            <m:endChr m:val=")"/>
+            <m:sepChr m:val=""/>
+            <m:grow/>
+          </m:dPr>
+          <m:e>
+            <m:r>
+              <m:t>N</m:t>
+            </m:r>
+          </m:e>
+        </m:d>
+      </m:oMath>
+      <w:r>
+        <w:t xml:space="preserve"> </w:t>
+      </w:r>
+      <w:r>
+        <w:t xml:space="preserve">storage.</w:t>
+      </w:r>
+      <w:r>
+        <w:t xml:space="preserve"> </w:t>
+      </w:r>
+      <m:oMath>
+        <m:r>
+          <m:rPr>
+            <m:sty m:val="p"/>
+          </m:rPr>
+          <m:t>▫</m:t>
+        </m:r>
+      </m:oMath>
+    </w:p>
+    <w:p>
+      <w:pPr>
+        <w:pStyle w:val="BodyText"/>
+      </w:pPr>
+      <w:r>
+        <w:t xml:space="preserve">For this problem, compute</w:t>
+      </w:r>
+      <w:r>
+        <w:t xml:space="preserve"> </w:t>
+      </w:r>
+      <m:oMath>
+        <m:r>
+          <m:t>L</m:t>
+        </m:r>
+      </m:oMath>
+      <w:r>
+        <w:t xml:space="preserve"> </w:t>
+      </w:r>
+      <w:r>
+        <w:t xml:space="preserve">once and take</w:t>
+      </w:r>
+      <w:r>
+        <w:t xml:space="preserve"> </w:t>
+      </w:r>
+      <m:oMath>
+        <m:r>
+          <m:t>N</m:t>
+        </m:r>
+        <m:r>
+          <m:rPr>
+            <m:sty m:val="p"/>
+          </m:rPr>
+          <m:t>=</m:t>
+        </m:r>
+        <m:r>
+          <m:t>h</m:t>
+        </m:r>
+      </m:oMath>
+      <w:r>
+        <w:t xml:space="preserve">,</w:t>
+      </w:r>
+      <w:r>
+        <w:t xml:space="preserve"> </w:t>
+      </w:r>
+      <m:oMath>
+        <m:r>
+          <m:t>k</m:t>
+        </m:r>
+        <m:r>
+          <m:rPr>
+            <m:sty m:val="p"/>
+          </m:rPr>
+          <m:t>=</m:t>
+        </m:r>
+        <m:r>
+          <m:t>n</m:t>
+        </m:r>
+        <m:r>
+          <m:rPr>
+            <m:sty m:val="p"/>
+          </m:rPr>
+          <m:t>−</m:t>
+        </m:r>
+        <m:r>
+          <m:t>L</m:t>
+        </m:r>
+      </m:oMath>
+      <w:r>
+        <w:t xml:space="preserve">, and</w:t>
+      </w:r>
+      <w:r>
+        <w:t xml:space="preserve"> </w:t>
+      </w:r>
+      <m:oMath>
+        <m:r>
+          <m:rPr>
+            <m:sty m:val="p"/>
+            <m:scr m:val="script"/>
+          </m:rPr>
+          <m:t>F</m:t>
+        </m:r>
+      </m:oMath>
+      <w:r>
+        <w:t xml:space="preserve"> </w:t>
+      </w:r>
+      <w:r>
+        <w:t xml:space="preserve">to be all optimal omission sets. Realize</w:t>
+      </w:r>
+      <w:r>
+        <w:t xml:space="preserve"> </w:t>
+      </w:r>
+      <m:oMath>
+        <m:r>
+          <m:t>I</m:t>
+        </m:r>
+        <m:d>
+          <m:dPr>
+            <m:begChr m:val="("/>
+            <m:endChr m:val=")"/>
+            <m:sepChr m:val=""/>
+            <m:grow/>
+          </m:dPr>
+          <m:e>
+            <m:r>
+              <m:t>Y</m:t>
+            </m:r>
+          </m:e>
+        </m:d>
+      </m:oMath>
+      <w:r>
+        <w:t xml:space="preserve"> </w:t>
+      </w:r>
+      <w:r>
+        <w:t xml:space="preserve">by requiring selected every mutable index outside</w:t>
+      </w:r>
+      <w:r>
+        <w:t xml:space="preserve"> </w:t>
+      </w:r>
+      <m:oMath>
+        <m:r>
+          <m:t>Y</m:t>
+        </m:r>
+      </m:oMath>
+      <w:r>
+        <w:t xml:space="preserve"> </w:t>
+      </w:r>
+      <w:r>
+        <w:t xml:space="preserve">and checking whether the score is still</w:t>
+      </w:r>
+      <w:r>
+        <w:t xml:space="preserve"> </w:t>
+      </w:r>
+      <m:oMath>
+        <m:r>
+          <m:t>L</m:t>
+        </m:r>
+      </m:oMath>
+      <w:r>
+        <w:t xml:space="preserve">. Lemma 5 extends directly to an arbitrary required-selected mask: its prefix counts reject starts and gaps that skip required indices, and the event order is unchanged. The cost remains that of Lemma 6. Proposition 9 and Lemma 8 therefore recover Theorem 1 using only inclusion queries. The fixed prefix is essential along this greedy path; the argument does not produce a general extension oracle. This elementary specialization is included for attribution and clarity, without a priority claim.</w:t>
+      </w:r>
+    </w:p>
+    <w:p>
+      <w:pPr>
+        <w:pStyle w:val="BodyText"/>
+      </w:pPr>
+      <w:r>
+        <w:t xml:space="preserve">The arbitrary-witness algorithm cannot simply be declared canonical. For</w:t>
+      </w:r>
+      <w:r>
+        <w:t xml:space="preserve"> </w:t>
+      </w:r>
+      <m:oMath>
+        <m:r>
+          <m:rPr>
+            <m:sty m:val="p"/>
+            <m:scr m:val="script"/>
+          </m:rPr>
+          <m:t>F</m:t>
+        </m:r>
+        <m:r>
+          <m:rPr>
+            <m:sty m:val="p"/>
+          </m:rPr>
+          <m:t>=</m:t>
+        </m:r>
+        <m:r>
+          <m:rPr>
+            <m:sty m:val="p"/>
+          </m:rPr>
+          <m:t>{</m:t>
+        </m:r>
+        <m:r>
+          <m:rPr>
+            <m:sty m:val="p"/>
+          </m:rPr>
+          <m:t>{</m:t>
+        </m:r>
+        <m:r>
+          <m:t>1</m:t>
+        </m:r>
+        <m:r>
+          <m:rPr>
+            <m:sty m:val="p"/>
+          </m:rPr>
+          <m:t>,</m:t>
+        </m:r>
+        <m:r>
+          <m:t>4</m:t>
+        </m:r>
+        <m:r>
+          <m:rPr>
+            <m:sty m:val="p"/>
+          </m:rPr>
+          <m:t>}</m:t>
+        </m:r>
+        <m:r>
+          <m:rPr>
+            <m:sty m:val="p"/>
+          </m:rPr>
+          <m:t>,</m:t>
+        </m:r>
+        <m:r>
+          <m:rPr>
+            <m:sty m:val="p"/>
+          </m:rPr>
+          <m:t>{</m:t>
+        </m:r>
+        <m:r>
+          <m:t>2</m:t>
+        </m:r>
+        <m:r>
+          <m:rPr>
+            <m:sty m:val="p"/>
+          </m:rPr>
+          <m:t>,</m:t>
+        </m:r>
+        <m:r>
+          <m:t>3</m:t>
+        </m:r>
+        <m:r>
+          <m:rPr>
+            <m:sty m:val="p"/>
+          </m:rPr>
+          <m:t>}</m:t>
+        </m:r>
+        <m:r>
+          <m:rPr>
+            <m:sty m:val="p"/>
+          </m:rPr>
+          <m:t>}</m:t>
+        </m:r>
+      </m:oMath>
+      <w:r>
+        <w:t xml:space="preserve"> </w:t>
+      </w:r>
+      <w:r>
+        <w:t xml:space="preserve">on</w:t>
+      </w:r>
+      <w:r>
+        <w:t xml:space="preserve"> </w:t>
+      </w:r>
+      <m:oMath>
+        <m:d>
+          <m:dPr>
+            <m:begChr m:val="["/>
+            <m:endChr m:val="]"/>
+            <m:sepChr m:val=""/>
+            <m:grow/>
+          </m:dPr>
+          <m:e>
+            <m:r>
+              <m:t>5</m:t>
+            </m:r>
+          </m:e>
+        </m:d>
+      </m:oMath>
+      <w:r>
+        <w:t xml:space="preserve">, an allowed first partition in Algorithm 1 of Björklund et al. is</w:t>
+      </w:r>
+      <w:r>
+        <w:t xml:space="preserve"> </w:t>
+      </w:r>
+      <m:oMath>
+        <m:r>
+          <m:rPr>
+            <m:sty m:val="p"/>
+          </m:rPr>
+          <m:t>{</m:t>
+        </m:r>
+        <m:r>
+          <m:t>2</m:t>
+        </m:r>
+        <m:r>
+          <m:rPr>
+            <m:sty m:val="p"/>
+          </m:rPr>
+          <m:t>,</m:t>
+        </m:r>
+        <m:r>
+          <m:t>3</m:t>
+        </m:r>
+        <m:r>
+          <m:rPr>
+            <m:sty m:val="p"/>
+          </m:rPr>
+          <m:t>}</m:t>
+        </m:r>
+      </m:oMath>
+      <w:r>
+        <w:t xml:space="preserve"> </w:t>
+      </w:r>
+      <w:r>
+        <w:t xml:space="preserve">and</w:t>
+      </w:r>
+      <w:r>
+        <w:t xml:space="preserve"> </w:t>
+      </w:r>
+      <m:oMath>
+        <m:r>
+          <m:rPr>
+            <m:sty m:val="p"/>
+          </m:rPr>
+          <m:t>{</m:t>
+        </m:r>
+        <m:r>
+          <m:t>1</m:t>
+        </m:r>
+        <m:r>
+          <m:rPr>
+            <m:sty m:val="p"/>
+          </m:rPr>
+          <m:t>,</m:t>
+        </m:r>
+        <m:r>
+          <m:t>4</m:t>
+        </m:r>
+        <m:r>
+          <m:rPr>
+            <m:sty m:val="p"/>
+          </m:rPr>
+          <m:t>,</m:t>
+        </m:r>
+        <m:r>
+          <m:t>5</m:t>
+        </m:r>
+        <m:r>
+          <m:rPr>
+            <m:sty m:val="p"/>
+          </m:rPr>
+          <m:t>}</m:t>
+        </m:r>
+      </m:oMath>
+      <w:r>
+        <w:t xml:space="preserve">. Deleting the former leaves the witness</w:t>
+      </w:r>
+      <w:r>
+        <w:t xml:space="preserve"> </w:t>
+      </w:r>
+      <m:oMath>
+        <m:d>
+          <m:dPr>
+            <m:begChr m:val="("/>
+            <m:endChr m:val=")"/>
+            <m:sepChr m:val=""/>
+            <m:grow/>
+          </m:dPr>
+          <m:e>
+            <m:r>
+              <m:t>1</m:t>
+            </m:r>
+            <m:r>
+              <m:rPr>
+                <m:sty m:val="p"/>
+              </m:rPr>
+              <m:t>,</m:t>
+            </m:r>
+            <m:r>
+              <m:t>4</m:t>
+            </m:r>
+          </m:e>
+        </m:d>
+      </m:oMath>
+      <w:r>
+        <w:t xml:space="preserve">, although</w:t>
+      </w:r>
+      <w:r>
+        <w:t xml:space="preserve"> </w:t>
+      </w:r>
+      <m:oMath>
+        <m:d>
+          <m:dPr>
+            <m:begChr m:val="("/>
+            <m:endChr m:val=")"/>
+            <m:sepChr m:val=""/>
+            <m:grow/>
+          </m:dPr>
+          <m:e>
+            <m:r>
+              <m:t>2</m:t>
+            </m:r>
+            <m:r>
+              <m:rPr>
+                <m:sty m:val="p"/>
+              </m:rPr>
+              <m:t>,</m:t>
+            </m:r>
+            <m:r>
+              <m:t>3</m:t>
+            </m:r>
+          </m:e>
+        </m:d>
+      </m:oMath>
+      <w:r>
+        <w:t xml:space="preserve"> </w:t>
+      </w:r>
+      <w:r>
+        <w:t xml:space="preserve">is lexicographically greater. Both have cardinality two and weight five. This is an abstract oracle-family example, not a claim that this exact family occurs for some input array. It respects that algorithm’s arbitrary-witness guarantee and refutes only the proposed automatic canonical transfer. Ordered deletion repairs the transfer without introducing a new general extraction principle.</w:t>
+      </w:r>
+    </w:p>
     <w:bookmarkEnd w:id="26"/>
-    <w:bookmarkStart w:id="27" w:name="implementation-defect-and-correction"/>
+    <w:bookmarkEnd w:id="27"/>
+    <w:bookmarkStart w:id="28" w:name="implementation-defect-and-correction"/>
     <w:p>
       <w:pPr>
         <w:pStyle w:val="Heading1"/>
@@ -7800,7 +9352,7 @@
         <w:t xml:space="preserve"> </w:t>
       </w:r>
       <w:r>
-        <w:t xml:space="preserve">(Saridakis 2026)</w:t>
+        <w:t xml:space="preserve">(Saridakis 2026b)</w:t>
       </w:r>
       <w:r>
         <w:t xml:space="preserve">. The corrected file is</w:t>
@@ -7818,8 +9370,8 @@
         <w:t xml:space="preserve">. Its complete SHA-256 and the audit harness hash appear in the companion evidence manifest, avoiding ambiguity about which implementation supports the theorem.</w:t>
       </w:r>
     </w:p>
-    <w:bookmarkEnd w:id="27"/>
-    <w:bookmarkStart w:id="28" w:name="computational-audit"/>
+    <w:bookmarkEnd w:id="28"/>
+    <w:bookmarkStart w:id="30" w:name="computational-audit"/>
     <w:p>
       <w:pPr>
         <w:pStyle w:val="Heading1"/>
@@ -9094,8 +10646,43 @@
         <w:t xml:space="preserve">These observations are consistent with the explicit allocation argument in Section 7. Their precise byte counts depend on the runtime and do not establish a machine-independent empirical complexity law. The auxiliary bound for the corrected algorithm follows from object accounting in Theorem 1.</w:t>
       </w:r>
     </w:p>
-    <w:bookmarkEnd w:id="28"/>
-    <w:bookmarkStart w:id="29" w:name="discussion-and-limitations"/>
+    <w:bookmarkStart w:id="29" w:name="X60c107f7beff9e82d26599ba063d2611c9a175b"/>
+    <w:p>
+      <w:pPr>
+        <w:pStyle w:val="Heading2"/>
+      </w:pPr>
+      <w:r>
+        <w:t xml:space="preserve">Separate verification of the prior art reduction</w:t>
+      </w:r>
+    </w:p>
+    <w:p>
+      <w:pPr>
+        <w:pStyle w:val="FirstParagraph"/>
+      </w:pPr>
+      <w:r>
+        <w:t xml:space="preserve">The later priority investigation has its own immutable evidence snapshot and seed 20261024</w:t>
+      </w:r>
+      <w:r>
+        <w:t xml:space="preserve"> </w:t>
+      </w:r>
+      <w:r>
+        <w:t xml:space="preserve">(Saridakis 2026a)</w:t>
+      </w:r>
+      <w:r>
+        <w:t xml:space="preserve">. It checks Proposition 9 on all 2,228 nonempty uniform families over universes of sizes one through five, and on 3,000 random uniform families over universes of sizes six through fifteen. It also compares the inclusion-only composition with direct selected-tuple enumeration on 7,612 MOCOSO instances: 1,397 are feasible, and 29 have multiple optimal tuples. A further 30,448 arbitrary-required-selection score comparisons all agree. These experiments are separate from the earlier 80,283-instance corpus; no combined unique-instance total is claimed.</w:t>
+      </w:r>
+    </w:p>
+    <w:p>
+      <w:pPr>
+        <w:pStyle w:val="BodyText"/>
+      </w:pPr>
+      <w:r>
+        <w:t xml:space="preserve">The reduction-check program imports no repository solver and batches equal-difference events simultaneously, providing a different implementation of strictness from the production-style scheduler. Its all-pairs event construction and dense scratch merges deliberately favor clarity over speed. Its runtime is not evidence for the optimized asymptotic theorem. The recorded counterexamples distinguish arbitrary extraction from canonical extraction; they are not defects in the published arbitrary-witness guarantee. These finite checks support the mathematical reduction and do not establish literature priority or independent external replication.</w:t>
+      </w:r>
+    </w:p>
+    <w:bookmarkEnd w:id="29"/>
+    <w:bookmarkEnd w:id="30"/>
+    <w:bookmarkStart w:id="31" w:name="discussion-and-limitations"/>
     <w:p>
       <w:pPr>
         <w:pStyle w:val="Heading1"/>
@@ -9348,7 +10935,7 @@
         <w:t xml:space="preserve"> </w:t>
       </w:r>
       <w:r>
-        <w:t xml:space="preserve">(Saridakis 2026, G8 theorem laboratory)</w:t>
+        <w:t xml:space="preserve">(Saridakis 2026b, G8 theorem laboratory)</w:t>
       </w:r>
       <w:r>
         <w:t xml:space="preserve">. This is a comparison with a repository-stated theoretical bound, not independent certification of every allocation in the G8 implementation, and not an external state-of-the-art ranking.</w:t>
@@ -9359,7 +10946,7 @@
         <w:pStyle w:val="BodyText"/>
       </w:pPr>
       <w:r>
-        <w:t xml:space="preserve">Five conclusions must be kept separate. Mathematical correctness is supported by the explicit derivation. Implementation correctness includes a verified space defect in the original and a corresponding correction. The asymptotic contribution is a specialized space-time tradeoff. Literature priority is unresolved. Scientific significance is bounded by the narrow regime, established ingredients, and absence of demonstrated applications or lower bounds. None of these conclusions follows automatically from any of the others.</w:t>
+        <w:t xml:space="preserve">Five conclusions must be kept separate. Mathematical correctness is supported by the explicit derivation. Implementation correctness includes a verified space defect in the original and a corresponding correction. The asymptotic contribution is a specialized space-time tradeoff. Priority for the general mechanisms belongs to earlier work; priority for an explicit statement of this complete specialized theorem remains unresolved. Scientific significance is modest and incremental, limited by the narrow regime, established ingredients, and absence of demonstrated applications or lower bounds. None of these conclusions follows automatically from any of the others.</w:t>
       </w:r>
     </w:p>
     <w:p>
@@ -9367,30 +10954,7 @@
         <w:pStyle w:val="BodyText"/>
       </w:pPr>
       <w:r>
-        <w:t xml:space="preserve">Several limitations remain. The algorithm assumes</w:t>
-      </w:r>
-      <w:r>
-        <w:t xml:space="preserve"> </w:t>
-      </w:r>
-      <m:oMath>
-        <m:r>
-          <m:t>h</m:t>
-        </m:r>
-        <m:r>
-          <m:rPr>
-            <m:sty m:val="p"/>
-          </m:rPr>
-          <m:t>&lt;</m:t>
-        </m:r>
-        <m:r>
-          <m:t>n</m:t>
-        </m:r>
-      </m:oMath>
-      <w:r>
-        <w:t xml:space="preserve"> </w:t>
-      </w:r>
-      <w:r>
-        <w:t xml:space="preserve">and does not solve all modulus regimes within these bounds. Arithmetic on arbitrary-size values is charged through a wide-word model. The experiments are finite, predominantly small, and not an industrial benchmark. The independent reference programs and the proof were prepared in an AI-assisted workflow within the same session; external expert replication remains valuable. The literature search is source-specific but not exhaustive. The correctness theorem can survive a priority discovery even if the paper’s novelty case does not.</w:t>
+        <w:t xml:space="preserve">The strongest overlap case grants all the difference-sorted sweep, exact-resource DP, sparse extraction, and ordered self-reduction to prior methods. What remains is the deficit-specific reduction, legal-event count, combined canonical guarantee, and reproducible storage correction. Because their composition is elementary once these observations are available, the result should be evaluated as a specialized technical note. The absence of a matching search result cannot turn it into a new general algorithmic principle.</w:t>
       </w:r>
     </w:p>
     <w:p>
@@ -9398,25 +10962,56 @@
         <w:pStyle w:val="BodyText"/>
       </w:pPr>
       <w:r>
-        <w:t xml:space="preserve">Useful subsequent work would identify a substantive application or a broader parameter regime, prove stronger tradeoffs, or establish a meaningful lower bound. Such possibilities are research questions, not results of this note. A venue decision should depend on the surviving specialized theorem and the reproducible correction, not on the availability of polished manuscript files.</w:t>
-      </w:r>
-    </w:p>
-    <w:bookmarkEnd w:id="29"/>
-    <w:bookmarkStart w:id="30" w:name="conclusion"/>
-    <w:p>
-      <w:pPr>
-        <w:pStyle w:val="Heading1"/>
-      </w:pPr>
-      <w:r>
-        <w:t xml:space="preserve">10 Conclusion</w:t>
+        <w:t xml:space="preserve">Several limitations remain. The algorithm assumes</w:t>
+      </w:r>
+      <w:r>
+        <w:t xml:space="preserve"> </w:t>
+      </w:r>
+      <m:oMath>
+        <m:r>
+          <m:t>h</m:t>
+        </m:r>
+        <m:r>
+          <m:rPr>
+            <m:sty m:val="p"/>
+          </m:rPr>
+          <m:t>&lt;</m:t>
+        </m:r>
+        <m:r>
+          <m:t>n</m:t>
+        </m:r>
+      </m:oMath>
+      <w:r>
+        <w:t xml:space="preserve"> </w:t>
+      </w:r>
+      <w:r>
+        <w:t xml:space="preserve">and does not solve all modulus regimes within these bounds. Arithmetic on arbitrary-size values is charged through a wide-word model. The experiments are finite, predominantly small, and not an industrial benchmark. The independent reference programs and the proof were prepared in an AI-assisted workflow within the same session; external expert replication remains valuable. The literature search is source-specific but not exhaustive. The correctness theorem can survive a priority discovery even if the paper’s novelty case does not.</w:t>
       </w:r>
     </w:p>
     <w:p>
       <w:pPr>
+        <w:pStyle w:val="BodyText"/>
+      </w:pPr>
+      <w:r>
+        <w:t xml:space="preserve">Useful subsequent work would identify a substantive application or a broader parameter regime, prove stronger tradeoffs, or establish a meaningful lower bound. Such possibilities are research questions, not results of this note. A venue decision should depend on the surviving specialized theorem and the reproducible correction, not on the availability of polished manuscript files.</w:t>
+      </w:r>
+    </w:p>
+    <w:bookmarkEnd w:id="31"/>
+    <w:bookmarkStart w:id="32" w:name="conclusion"/>
+    <w:p>
+      <w:pPr>
+        <w:pStyle w:val="Heading1"/>
+      </w:pPr>
+      <w:r>
+        <w:t xml:space="preserve">10 Conclusion</w:t>
+      </w:r>
+    </w:p>
+    <w:p>
+      <w:pPr>
         <w:pStyle w:val="FirstParagraph"/>
       </w:pPr>
       <w:r>
-        <w:t xml:space="preserve">In the high-modulus small-deficit regime, exact modular feasibility confines all omissions to a short prefix and bounds their number by a square root of the deficit. A constrained sorted-difference scalar DP then supports monotone searches for the lexicographically greatest omitted tuple, whose complement is the globally least complete optimal witness. Charging all searches and output operations gives quadratic auxiliary wide-word space and</w:t>
+        <w:t xml:space="preserve">In the high-modulus small-deficit regime, exact modular feasibility confines all omissions to a short prefix and bounds their number by a square root of the deficit. A resource-lifted sorted-difference sweep supports ordered searches for the lexicographically greatest omitted tuple, whose complement is the globally least complete optimal witness. Charging all queries and output operations gives quadratic auxiliary wide-word space and</w:t>
       </w:r>
       <w:r>
         <w:t xml:space="preserve"> </w:t>
@@ -9526,11 +11121,11 @@
         <w:t xml:space="preserve"> </w:t>
       </w:r>
       <w:r>
-        <w:t xml:space="preserve">time for the corrected algorithm. The result is a specialized composition of established methods with a documented implementation correction; its literature priority and publication significance remain open to further assessment.</w:t>
+        <w:t xml:space="preserve">time for the corrected algorithm. Earlier work supplies the general sweep and sparse-extraction mechanisms; this note contributes their explicit specialization and implementation accounting. Its bounded novelty is compatible with a correct theorem, while worldwide priority and venue-level significance remain unresolved.</w:t>
       </w:r>
     </w:p>
-    <w:bookmarkEnd w:id="30"/>
-    <w:bookmarkStart w:id="31" w:name="artifact-availability-and-disclosure"/>
+    <w:bookmarkEnd w:id="32"/>
+    <w:bookmarkStart w:id="33" w:name="artifact-availability-and-disclosure"/>
     <w:p>
       <w:pPr>
         <w:pStyle w:val="Heading1"/>
@@ -9544,13 +11139,13 @@
         <w:pStyle w:val="FirstParagraph"/>
       </w:pPr>
       <w:r>
-        <w:t xml:space="preserve">The reproducible audit snapshot is linked in the references</w:t>
-      </w:r>
-      <w:r>
-        <w:t xml:space="preserve"> </w:t>
-      </w:r>
-      <w:r>
-        <w:t xml:space="preserve">(Saridakis 2026)</w:t>
+        <w:t xml:space="preserve">The original reproducible audit snapshot is linked in the references</w:t>
+      </w:r>
+      <w:r>
+        <w:t xml:space="preserve"> </w:t>
+      </w:r>
+      <w:r>
+        <w:t xml:space="preserve">(Saridakis 2026b)</w:t>
       </w:r>
       <w:r>
         <w:t xml:space="preserve">. From that commit, run</w:t>
@@ -9595,7 +11190,31 @@
         <w:t xml:space="preserve">results.json</w:t>
       </w:r>
       <w:r>
-        <w:t xml:space="preserve">; use a disposable checkout to preserve the committed evidence. The companion manuscript folder includes the claim-evidence map, source registry, review, contribution stress test, evidence hashes, and build instructions. Original G3–G9 research files are preserved.</w:t>
+        <w:t xml:space="preserve">; use a disposable checkout to preserve the committed evidence. The later priority snapshot</w:t>
+      </w:r>
+      <w:r>
+        <w:t xml:space="preserve"> </w:t>
+      </w:r>
+      <w:r>
+        <w:t xml:space="preserve">(Saridakis 2026a)</w:t>
+      </w:r>
+      <w:r>
+        <w:t xml:space="preserve"> </w:t>
+      </w:r>
+      <w:r>
+        <w:t xml:space="preserve">contains</w:t>
+      </w:r>
+      <w:r>
+        <w:t xml:space="preserve"> </w:t>
+      </w:r>
+      <w:r>
+        <w:rPr>
+          <w:rStyle w:val="VerbatimChar"/>
+        </w:rPr>
+        <w:t xml:space="preserve">research/v03/g9_priority/reduction_checks.py</w:t>
+      </w:r>
+      <w:r>
+        <w:t xml:space="preserve">, which prints its separate deterministic results without rewriting the preserved JSON. The companion manuscript folder includes claim mapping, source registry, review, contribution stress test, evidence hashes, revision record, and build instructions. Both evidence snapshots and original G3–G9 research files are preserved.</w:t>
       </w:r>
     </w:p>
     <w:p>
@@ -9606,8 +11225,8 @@
         <w:t xml:space="preserve">This manuscript was drafted with AI assistance, including source inspection, mathematical reconstruction, code execution, literature searches, and adversarial review. That review is an internal assisted critique, not external peer review. The named author’s review and responsibility for any eventual submission are required; no affiliation, funding award, external endorsement, or venue acceptance is asserted.</w:t>
       </w:r>
     </w:p>
-    <w:bookmarkEnd w:id="31"/>
-    <w:bookmarkStart w:id="45" w:name="references"/>
+    <w:bookmarkEnd w:id="33"/>
+    <w:bookmarkStart w:id="57" w:name="references"/>
     <w:p>
       <w:pPr>
         <w:pStyle w:val="Heading1"/>
@@ -9616,8 +11235,87 @@
         <w:t xml:space="preserve">References</w:t>
       </w:r>
     </w:p>
-    <w:bookmarkStart w:id="44" w:name="refs"/>
-    <w:bookmarkStart w:id="33" w:name="ref-erickson2019"/>
+    <w:bookmarkStart w:id="56" w:name="refs"/>
+    <w:bookmarkStart w:id="35" w:name="ref-bjorklund2014"/>
+    <w:p>
+      <w:pPr>
+        <w:pStyle w:val="Bibliography"/>
+      </w:pPr>
+      <w:r>
+        <w:t xml:space="preserve">Björklund, Andreas, Petteri Kaski, and Łukasz Kowalik. 2014.</w:t>
+      </w:r>
+      <w:r>
+        <w:t xml:space="preserve"> </w:t>
+      </w:r>
+      <w:r>
+        <w:t xml:space="preserve">“Fast Witness Extraction Using a Decision Oracle.”</w:t>
+      </w:r>
+      <w:r>
+        <w:t xml:space="preserve"> </w:t>
+      </w:r>
+      <w:r>
+        <w:t xml:space="preserve">In</w:t>
+      </w:r>
+      <w:r>
+        <w:t xml:space="preserve"> </w:t>
+      </w:r>
+      <w:r>
+        <w:rPr>
+          <w:iCs/>
+          <w:i/>
+        </w:rPr>
+        <w:t xml:space="preserve">Algorithms – ESA 2014</w:t>
+      </w:r>
+      <w:r>
+        <w:t xml:space="preserve">, 8737:149–60. Lecture Notes in Computer Science. Springer.</w:t>
+      </w:r>
+      <w:r>
+        <w:t xml:space="preserve"> </w:t>
+      </w:r>
+      <w:hyperlink r:id="rId34">
+        <w:r>
+          <w:rPr>
+            <w:rStyle w:val="Hyperlink"/>
+          </w:rPr>
+          <w:t xml:space="preserve">https://doi.org/10.1007/978-3-662-44777-2_13</w:t>
+        </w:r>
+      </w:hyperlink>
+      <w:r>
+        <w:t xml:space="preserve">.</w:t>
+      </w:r>
+    </w:p>
+    <w:bookmarkEnd w:id="35"/>
+    <w:bookmarkStart w:id="37" w:name="ref-creignou2017"/>
+    <w:p>
+      <w:pPr>
+        <w:pStyle w:val="Bibliography"/>
+      </w:pPr>
+      <w:r>
+        <w:t xml:space="preserve">Creignou, Nadia, Markus Kröll, Reinhard Pichler, Sebastian Skritek, and Heribert Vollmer. 2017.</w:t>
+      </w:r>
+      <w:r>
+        <w:t xml:space="preserve"> </w:t>
+      </w:r>
+      <w:r>
+        <w:t xml:space="preserve">“A Complexity Theory for Hard Enumeration Problems.”</w:t>
+      </w:r>
+      <w:r>
+        <w:t xml:space="preserve"> </w:t>
+      </w:r>
+      <w:hyperlink r:id="rId36">
+        <w:r>
+          <w:rPr>
+            <w:rStyle w:val="Hyperlink"/>
+          </w:rPr>
+          <w:t xml:space="preserve">https://arxiv.org/abs/1610.05493v2</w:t>
+        </w:r>
+      </w:hyperlink>
+      <w:r>
+        <w:t xml:space="preserve">.</w:t>
+      </w:r>
+    </w:p>
+    <w:bookmarkEnd w:id="37"/>
+    <w:bookmarkStart w:id="39" w:name="ref-erickson2019"/>
     <w:p>
       <w:pPr>
         <w:pStyle w:val="Bibliography"/>
@@ -9641,7 +11339,7 @@
       <w:r>
         <w:t xml:space="preserve"> </w:t>
       </w:r>
-      <w:hyperlink r:id="rId32">
+      <w:hyperlink r:id="rId38">
         <w:r>
           <w:rPr>
             <w:rStyle w:val="Hyperlink"/>
@@ -9653,8 +11351,8 @@
         <w:t xml:space="preserve">.</w:t>
       </w:r>
     </w:p>
-    <w:bookmarkEnd w:id="33"/>
-    <w:bookmarkStart w:id="35" w:name="ref-grosse2006"/>
+    <w:bookmarkEnd w:id="39"/>
+    <w:bookmarkStart w:id="41" w:name="ref-grosse2006"/>
     <w:p>
       <w:pPr>
         <w:pStyle w:val="Bibliography"/>
@@ -9671,7 +11369,7 @@
       <w:r>
         <w:t xml:space="preserve"> </w:t>
       </w:r>
-      <w:hyperlink r:id="rId34">
+      <w:hyperlink r:id="rId40">
         <w:r>
           <w:rPr>
             <w:rStyle w:val="Hyperlink"/>
@@ -9683,8 +11381,8 @@
         <w:t xml:space="preserve">.</w:t>
       </w:r>
     </w:p>
-    <w:bookmarkEnd w:id="35"/>
-    <w:bookmarkStart w:id="37" w:name="ref-jin2020"/>
+    <w:bookmarkEnd w:id="41"/>
+    <w:bookmarkStart w:id="43" w:name="ref-jin2020"/>
     <w:p>
       <w:pPr>
         <w:pStyle w:val="Bibliography"/>
@@ -9701,7 +11399,7 @@
       <w:r>
         <w:t xml:space="preserve"> </w:t>
       </w:r>
-      <w:hyperlink r:id="rId36">
+      <w:hyperlink r:id="rId42">
         <w:r>
           <w:rPr>
             <w:rStyle w:val="Hyperlink"/>
@@ -9713,8 +11411,8 @@
         <w:t xml:space="preserve">.</w:t>
       </w:r>
     </w:p>
-    <w:bookmarkEnd w:id="37"/>
-    <w:bookmarkStart w:id="39" w:name="ref-kluev2013"/>
+    <w:bookmarkEnd w:id="43"/>
+    <w:bookmarkStart w:id="45" w:name="ref-kluev2013"/>
     <w:p>
       <w:pPr>
         <w:pStyle w:val="Bibliography"/>
@@ -9746,7 +11444,7 @@
       <w:r>
         <w:t xml:space="preserve"> </w:t>
       </w:r>
-      <w:hyperlink r:id="rId38">
+      <w:hyperlink r:id="rId44">
         <w:r>
           <w:rPr>
             <w:rStyle w:val="Hyperlink"/>
@@ -9758,14 +11456,44 @@
         <w:t xml:space="preserve">.</w:t>
       </w:r>
     </w:p>
-    <w:bookmarkEnd w:id="39"/>
-    <w:bookmarkStart w:id="41" w:name="ref-mocoso2026"/>
+    <w:bookmarkEnd w:id="45"/>
+    <w:bookmarkStart w:id="47" w:name="ref-meeks2018"/>
     <w:p>
       <w:pPr>
         <w:pStyle w:val="Bibliography"/>
       </w:pPr>
       <w:r>
-        <w:t xml:space="preserve">Saridakis, Stamatis-Christos. 2026.</w:t>
+        <w:t xml:space="preserve">Meeks, Kitty. 2018.</w:t>
+      </w:r>
+      <w:r>
+        <w:t xml:space="preserve"> </w:t>
+      </w:r>
+      <w:r>
+        <w:t xml:space="preserve">“Randomised Enumeration of Small Witnesses Using a Decision Oracle.”</w:t>
+      </w:r>
+      <w:r>
+        <w:t xml:space="preserve"> </w:t>
+      </w:r>
+      <w:hyperlink r:id="rId46">
+        <w:r>
+          <w:rPr>
+            <w:rStyle w:val="Hyperlink"/>
+          </w:rPr>
+          <w:t xml:space="preserve">https://arxiv.org/abs/1509.05572v4</w:t>
+        </w:r>
+      </w:hyperlink>
+      <w:r>
+        <w:t xml:space="preserve">.</w:t>
+      </w:r>
+    </w:p>
+    <w:bookmarkEnd w:id="47"/>
+    <w:bookmarkStart w:id="49" w:name="ref-mocosopriority2026"/>
+    <w:p>
+      <w:pPr>
+        <w:pStyle w:val="Bibliography"/>
+      </w:pPr>
+      <w:r>
+        <w:t xml:space="preserve">Saridakis, Stamatis-Christos. 2026a.</w:t>
       </w:r>
       <w:r>
         <w:t xml:space="preserve"> </w:t>
@@ -9774,6 +11502,45 @@
         <w:t xml:space="preserve">“</w:t>
       </w:r>
       <w:r>
+        <w:t xml:space="preserve">MOCOSO G9</w:t>
+      </w:r>
+      <w:r>
+        <w:t xml:space="preserve"> </w:t>
+      </w:r>
+      <w:r>
+        <w:t xml:space="preserve">Prior-Art Investigation and Independent Reduction Checks.”</w:t>
+      </w:r>
+      <w:r>
+        <w:t xml:space="preserve"> </w:t>
+      </w:r>
+      <w:hyperlink r:id="rId48">
+        <w:r>
+          <w:rPr>
+            <w:rStyle w:val="Hyperlink"/>
+          </w:rPr>
+          <w:t xml:space="preserve">https://github.com/SaridakisStamatisChristos/MOCOSO/tree/b23ca44be7f5a0932c209b2b4f80a221830ed8b2/research/v03/g9_priority</w:t>
+        </w:r>
+      </w:hyperlink>
+      <w:r>
+        <w:t xml:space="preserve">.</w:t>
+      </w:r>
+    </w:p>
+    <w:bookmarkEnd w:id="49"/>
+    <w:bookmarkStart w:id="51" w:name="ref-mocoso2026"/>
+    <w:p>
+      <w:pPr>
+        <w:pStyle w:val="Bibliography"/>
+      </w:pPr>
+      <w:r>
+        <w:t xml:space="preserve">———. 2026b.</w:t>
+      </w:r>
+      <w:r>
+        <w:t xml:space="preserve"> </w:t>
+      </w:r>
+      <w:r>
+        <w:t xml:space="preserve">“</w:t>
+      </w:r>
+      <w:r>
         <w:t xml:space="preserve">MOCOSO</w:t>
       </w:r>
       <w:r>
@@ -9797,7 +11564,7 @@
       <w:r>
         <w:t xml:space="preserve"> </w:t>
       </w:r>
-      <w:hyperlink r:id="rId40">
+      <w:hyperlink r:id="rId50">
         <w:r>
           <w:rPr>
             <w:rStyle w:val="Hyperlink"/>
@@ -9809,8 +11576,8 @@
         <w:t xml:space="preserve">.</w:t>
       </w:r>
     </w:p>
-    <w:bookmarkEnd w:id="41"/>
-    <w:bookmarkStart w:id="43" w:name="ref-turner2011"/>
+    <w:bookmarkEnd w:id="51"/>
+    <w:bookmarkStart w:id="53" w:name="ref-turner2011"/>
     <w:p>
       <w:pPr>
         <w:pStyle w:val="Bibliography"/>
@@ -9843,7 +11610,7 @@
       <w:r>
         <w:t xml:space="preserve"> </w:t>
       </w:r>
-      <w:hyperlink r:id="rId42">
+      <w:hyperlink r:id="rId52">
         <w:r>
           <w:rPr>
             <w:rStyle w:val="Hyperlink"/>
@@ -9855,9 +11622,55 @@
         <w:t xml:space="preserve">.</w:t>
       </w:r>
     </w:p>
-    <w:bookmarkEnd w:id="43"/>
-    <w:bookmarkEnd w:id="44"/>
-    <w:bookmarkEnd w:id="45"/>
+    <w:bookmarkEnd w:id="53"/>
+    <w:bookmarkStart w:id="55" w:name="ref-wu2014"/>
+    <w:p>
+      <w:pPr>
+        <w:pStyle w:val="Bibliography"/>
+      </w:pPr>
+      <w:r>
+        <w:t xml:space="preserve">Wu, Huanhuan, James Cheng, Silu Huang, Yiping Ke, Yi Lu, and Yanyan Xu. 2014.</w:t>
+      </w:r>
+      <w:r>
+        <w:t xml:space="preserve"> </w:t>
+      </w:r>
+      <w:r>
+        <w:t xml:space="preserve">“Path Problems in Temporal Graphs.”</w:t>
+      </w:r>
+      <w:r>
+        <w:t xml:space="preserve"> </w:t>
+      </w:r>
+      <w:r>
+        <w:rPr>
+          <w:iCs/>
+          <w:i/>
+        </w:rPr>
+        <w:t xml:space="preserve">Proceedings of the VLDB Endowment</w:t>
+      </w:r>
+      <w:r>
+        <w:t xml:space="preserve"> </w:t>
+      </w:r>
+      <w:r>
+        <w:t xml:space="preserve">7 (9): 721–32.</w:t>
+      </w:r>
+      <w:r>
+        <w:t xml:space="preserve"> </w:t>
+      </w:r>
+      <w:hyperlink r:id="rId54">
+        <w:r>
+          <w:rPr>
+            <w:rStyle w:val="Hyperlink"/>
+          </w:rPr>
+          <w:t xml:space="preserve">https://doi.org/10.14778/2732939.2732945</w:t>
+        </w:r>
+      </w:hyperlink>
+      <w:r>
+        <w:t xml:space="preserve">.</w:t>
+      </w:r>
+    </w:p>
+    <w:bookmarkEnd w:id="55"/>
+    <w:bookmarkEnd w:id="56"/>
+    <w:bookmarkEnd w:id="57"/>
     <w:sectPr>
       <w:footerReference w:type="default" r:id="rId9"/>
       <w:pgSz w:w="12240" w:h="15840"/>

</xml_diff>